<commit_message>
Add identity, serving and cache to the production design
Three audiences rather than the binary internal/external fork: chunks
carry audience tags and retrieval filters to the caller's set, resolved
by an identity step in production and asserted at the CLI today.
Adds a serving layer (generation queue, rate limiting, extract-only
under load) and an answer cache keyed on template, slots, audience and
index version, with the matching rationale rows and shortcomings.
</commit_message>
<xml_diff>
--- a/docs/architecture/architecture-rationale.docx
+++ b/docs/architecture/architecture-rationale.docx
@@ -1636,7 +1636,7 @@
               <w:rPr>
                 <w:sz w:val="19"/>
               </w:rPr>
-              <w:t>Per chunk: embedding, product, document, section, date, authority rank, audience tag. Manifest: every document with type, authority rank, audience tag, date, link and its caveat sentences; excluded documents by name and link; contact text and the product, colour and merchant name lists from the crawl; embedding-model tag and chunking version — the engine refuses to run on a mismatch of either</w:t>
+              <w:t>Per chunk: embedding, product, document, section, date, authority rank, audience tags (public, trade, staff). Manifest: every document with type, authority rank, audience tag, date, link and its caveat sentences; excluded documents by name and link; contact text and the product, colour and merchant name lists from the crawl; embedding-model tag and chunking version — the engine refuses to run on a mismatch of either</w:t>
             </w:r>
           </w:p>
         </w:tc>
@@ -2055,7 +2055,7 @@
               <w:rPr>
                 <w:sz w:val="19"/>
               </w:rPr>
-              <w:t>Question and mode in; answer, sources, refusal, diagnostics out</w:t>
+              <w:t>Question and audience set in; answer, sources, refusal, diagnostics out</w:t>
             </w:r>
           </w:p>
         </w:tc>
@@ -2099,7 +2099,7 @@
               <w:rPr>
                 <w:sz w:val="19"/>
               </w:rPr>
-              <w:t>Single user, single turn; real enquiries run six turns</w:t>
+              <w:t>Single user, single turn; real enquiries run six turns; the audience set is asserted, not authenticated</w:t>
             </w:r>
           </w:p>
         </w:tc>
@@ -2294,6 +2294,289 @@
           </w:p>
         </w:tc>
       </w:tr>
+      <w:tr>
+        <w:tc>
+          <w:tcPr>
+            <w:tcW w:type="dxa" w:w="2160"/>
+          </w:tcPr>
+          <w:p>
+            <w:pPr>
+              <w:spacing w:after="40"/>
+            </w:pPr>
+            <w:r>
+              <w:rPr>
+                <w:sz w:val="19"/>
+              </w:rPr>
+            </w:r>
+            <w:r>
+              <w:rPr>
+                <w:b/>
+                <w:sz w:val="19"/>
+              </w:rPr>
+              <w:t>Identity and audience</w:t>
+            </w:r>
+            <w:r>
+              <w:rPr>
+                <w:sz w:val="19"/>
+              </w:rPr>
+              <w:t xml:space="preserve"> (production)</w:t>
+            </w:r>
+          </w:p>
+        </w:tc>
+        <w:tc>
+          <w:tcPr>
+            <w:tcW w:type="dxa" w:w="2160"/>
+          </w:tcPr>
+          <w:p>
+            <w:pPr>
+              <w:spacing w:after="40"/>
+            </w:pPr>
+            <w:r>
+              <w:rPr>
+                <w:sz w:val="19"/>
+              </w:rPr>
+            </w:r>
+            <w:r>
+              <w:rPr>
+                <w:sz w:val="19"/>
+              </w:rPr>
+              <w:t>Resolves the caller to an audience set — public, trade or staff; anonymous gets public only</w:t>
+            </w:r>
+          </w:p>
+        </w:tc>
+        <w:tc>
+          <w:tcPr>
+            <w:tcW w:type="dxa" w:w="2160"/>
+          </w:tcPr>
+          <w:p>
+            <w:pPr>
+              <w:spacing w:after="40"/>
+            </w:pPr>
+            <w:r>
+              <w:rPr>
+                <w:sz w:val="19"/>
+              </w:rPr>
+            </w:r>
+            <w:r>
+              <w:rPr>
+                <w:sz w:val="19"/>
+              </w:rPr>
+              <w:t>The audience filter is only as trustworthy as the claim behind it, and the three segments of §6.2 need three audiences, not the binary internal/external fork of §6.4: trade partners see lead times, stock and kit lists that the public does not</w:t>
+            </w:r>
+          </w:p>
+        </w:tc>
+        <w:tc>
+          <w:tcPr>
+            <w:tcW w:type="dxa" w:w="2160"/>
+          </w:tcPr>
+          <w:p>
+            <w:pPr>
+              <w:spacing w:after="40"/>
+            </w:pPr>
+            <w:r>
+              <w:rPr>
+                <w:sz w:val="19"/>
+              </w:rPr>
+            </w:r>
+            <w:r>
+              <w:rPr>
+                <w:sz w:val="19"/>
+              </w:rPr>
+              <w:t>Not built. At the CLI today the audience set is asserted, so a caller could claim staff</w:t>
+            </w:r>
+          </w:p>
+        </w:tc>
+      </w:tr>
+      <w:tr>
+        <w:tc>
+          <w:tcPr>
+            <w:tcW w:type="dxa" w:w="2160"/>
+            <w:shd w:val="clear" w:color="auto" w:fill="F3F4F6"/>
+          </w:tcPr>
+          <w:p>
+            <w:pPr>
+              <w:spacing w:after="40"/>
+            </w:pPr>
+            <w:r>
+              <w:rPr>
+                <w:sz w:val="19"/>
+              </w:rPr>
+            </w:r>
+            <w:r>
+              <w:rPr>
+                <w:b/>
+                <w:sz w:val="19"/>
+              </w:rPr>
+              <w:t>Serving layer</w:t>
+            </w:r>
+            <w:r>
+              <w:rPr>
+                <w:sz w:val="19"/>
+              </w:rPr>
+              <w:t xml:space="preserve"> (production)</w:t>
+            </w:r>
+          </w:p>
+        </w:tc>
+        <w:tc>
+          <w:tcPr>
+            <w:tcW w:type="dxa" w:w="2160"/>
+            <w:shd w:val="clear" w:color="auto" w:fill="F3F4F6"/>
+          </w:tcPr>
+          <w:p>
+            <w:pPr>
+              <w:spacing w:after="40"/>
+            </w:pPr>
+            <w:r>
+              <w:rPr>
+                <w:sz w:val="19"/>
+              </w:rPr>
+            </w:r>
+            <w:r>
+              <w:rPr>
+                <w:sz w:val="19"/>
+              </w:rPr>
+              <w:t>Generation queue with a visible wait, per-session rate limiting, extract-only degradation under load</w:t>
+            </w:r>
+          </w:p>
+        </w:tc>
+        <w:tc>
+          <w:tcPr>
+            <w:tcW w:type="dxa" w:w="2160"/>
+            <w:shd w:val="clear" w:color="auto" w:fill="F3F4F6"/>
+          </w:tcPr>
+          <w:p>
+            <w:pPr>
+              <w:spacing w:after="40"/>
+            </w:pPr>
+            <w:r>
+              <w:rPr>
+                <w:sz w:val="19"/>
+              </w:rPr>
+            </w:r>
+            <w:r>
+              <w:rPr>
+                <w:sz w:val="19"/>
+              </w:rPr>
+              <w:t>Retrieval scales trivially — a snapshot read is lock-free; generation is the only bottleneck, one at a time per Ollama instance. Under load the system drops the expensive path, never a check</w:t>
+            </w:r>
+          </w:p>
+        </w:tc>
+        <w:tc>
+          <w:tcPr>
+            <w:tcW w:type="dxa" w:w="2160"/>
+            <w:shd w:val="clear" w:color="auto" w:fill="F3F4F6"/>
+          </w:tcPr>
+          <w:p>
+            <w:pPr>
+              <w:spacing w:after="40"/>
+            </w:pPr>
+            <w:r>
+              <w:rPr>
+                <w:sz w:val="19"/>
+              </w:rPr>
+            </w:r>
+            <w:r>
+              <w:rPr>
+                <w:sz w:val="19"/>
+              </w:rPr>
+              <w:t>The compose answers that a busy hour needs most are the first to go; a queue with a visible wait is honest but still a wait</w:t>
+            </w:r>
+          </w:p>
+        </w:tc>
+      </w:tr>
+      <w:tr>
+        <w:tc>
+          <w:tcPr>
+            <w:tcW w:type="dxa" w:w="2160"/>
+          </w:tcPr>
+          <w:p>
+            <w:pPr>
+              <w:spacing w:after="40"/>
+            </w:pPr>
+            <w:r>
+              <w:rPr>
+                <w:sz w:val="19"/>
+              </w:rPr>
+            </w:r>
+            <w:r>
+              <w:rPr>
+                <w:b/>
+                <w:sz w:val="19"/>
+              </w:rPr>
+              <w:t>Answer cache</w:t>
+            </w:r>
+            <w:r>
+              <w:rPr>
+                <w:sz w:val="19"/>
+              </w:rPr>
+              <w:t xml:space="preserve"> (production)</w:t>
+            </w:r>
+          </w:p>
+        </w:tc>
+        <w:tc>
+          <w:tcPr>
+            <w:tcW w:type="dxa" w:w="2160"/>
+          </w:tcPr>
+          <w:p>
+            <w:pPr>
+              <w:spacing w:after="40"/>
+            </w:pPr>
+            <w:r>
+              <w:rPr>
+                <w:sz w:val="19"/>
+              </w:rPr>
+            </w:r>
+            <w:r>
+              <w:rPr>
+                <w:sz w:val="19"/>
+              </w:rPr>
+              <w:t>Composite parts keyed on template, slots, audience set and index version</w:t>
+            </w:r>
+          </w:p>
+        </w:tc>
+        <w:tc>
+          <w:tcPr>
+            <w:tcW w:type="dxa" w:w="2160"/>
+          </w:tcPr>
+          <w:p>
+            <w:pPr>
+              <w:spacing w:after="40"/>
+            </w:pPr>
+            <w:r>
+              <w:rPr>
+                <w:sz w:val="19"/>
+              </w:rPr>
+            </w:r>
+            <w:r>
+              <w:rPr>
+                <w:sz w:val="19"/>
+              </w:rPr>
+              <w:t>Roughly eighty per cent of demand is nineteen question templates (§7.5), and temperature-zero answers over a fixed snapshot are safe to reuse. The atomic swap is a free cache epoch — a re-index expires everything with no invalidation logic</w:t>
+            </w:r>
+          </w:p>
+        </w:tc>
+        <w:tc>
+          <w:tcPr>
+            <w:tcW w:type="dxa" w:w="2160"/>
+          </w:tcPr>
+          <w:p>
+            <w:pPr>
+              <w:spacing w:after="40"/>
+            </w:pPr>
+            <w:r>
+              <w:rPr>
+                <w:sz w:val="19"/>
+              </w:rPr>
+            </w:r>
+            <w:r>
+              <w:rPr>
+                <w:sz w:val="19"/>
+              </w:rPr>
+              <w:t>The key must carry the audience set or a staff answer reaches a public caller; keyed too loosely it serves the right template for the wrong substrate</w:t>
+            </w:r>
+          </w:p>
+        </w:tc>
+      </w:tr>
     </w:tbl>
     <w:p>
       <w:pPr>
@@ -2353,6 +2636,34 @@
       </w:r>
       <w:r>
         <w:t xml:space="preserve"> A passage that names the property without answering it passes the gate; what then prints is what the sheet actually says ("high breathability", no figure), which is the honest result, not a hallucination.</w:t>
+      </w:r>
+    </w:p>
+    <w:p>
+      <w:pPr>
+        <w:pStyle w:val="ListBullet"/>
+      </w:pPr>
+      <w:r>
+        <w:rPr>
+          <w:b/>
+        </w:rPr>
+        <w:t>The audience set is asserted, not authenticated.</w:t>
+      </w:r>
+      <w:r>
+        <w:t xml:space="preserve"> The filter is real and enforced in code at retrieval; what is missing is the identity behind the claim. One user, one machine, no accounts — and the not-built list says so.</w:t>
+      </w:r>
+    </w:p>
+    <w:p>
+      <w:pPr>
+        <w:pStyle w:val="ListBullet"/>
+      </w:pPr>
+      <w:r>
+        <w:rPr>
+          <w:b/>
+        </w:rPr>
+        <w:t>One user at a time.</w:t>
+      </w:r>
+      <w:r>
+        <w:t xml:space="preserve"> No queue, no rate limit, no cache; the concurrency story is drawn as production boxes and argued, not built.</w:t>
       </w:r>
     </w:p>
     <w:p>
@@ -2459,6 +2770,34 @@
       </w:r>
       <w:r>
         <w:t xml:space="preserve"> — See decision 1: forty was a scope signal in a prompt; the boundary is a rule, and its cost is extraction QA, bounded by the spend order.</w:t>
+      </w:r>
+    </w:p>
+    <w:p>
+      <w:pPr>
+        <w:pStyle w:val="ListBullet"/>
+      </w:pPr>
+      <w:r>
+        <w:rPr>
+          <w:i/>
+        </w:rPr>
+        <w:t>How does this handle hundreds of concurrent users?</w:t>
+      </w:r>
+      <w:r>
+        <w:t xml:space="preserve"> — Retrieval doesn't care: a snapshot read is lock-free. Generation is the bottleneck, so production puts a queue, a rate limit and a cache in front of it, and under load serves only extract, route and refuse. Safety never degrades; coverage does.</w:t>
+      </w:r>
+    </w:p>
+    <w:p>
+      <w:pPr>
+        <w:pStyle w:val="ListBullet"/>
+      </w:pPr>
+      <w:r>
+        <w:rPr>
+          <w:i/>
+        </w:rPr>
+        <w:t>How do you keep staff-only material out of public answers?</w:t>
+      </w:r>
+      <w:r>
+        <w:t xml:space="preserve"> — Audience tags on every chunk, filtered at retrieval in code, never by prompt. In production the audience set comes from an authenticated session; in the prototype it is an asserted flag, and that is on the not-built list.</w:t>
       </w:r>
     </w:p>
     <w:p>

</xml_diff>